<commit_message>
Add organization card and document date context
</commit_message>
<xml_diff>
--- a/backend/app/document_generation/documents/act_ispdn_commissioning/template.docx
+++ b/backend/app/document_generation/documents/act_ispdn_commissioning/template.docx
@@ -36,6 +36,7 @@
                 <w:rFonts w:ascii="Times New Roman" w:hAnsi="Times New Roman" w:cs="Times New Roman"/>
               </w:rPr>
             </w:pPr>
+            <w:proofErr w:type="gramStart"/>
             <w:r>
               <w:rPr>
                 <w:rFonts w:ascii="Times New Roman" w:hAnsi="Times New Roman" w:cs="Times New Roman"/>
@@ -50,26 +51,28 @@
                 <w:rFonts w:ascii="Times New Roman" w:hAnsi="Times New Roman" w:cs="Times New Roman"/>
                 <w:sz w:val="24"/>
                 <w:szCs w:val="24"/>
-              </w:rPr>
-              <w:t>current</w:t>
-            </w:r>
-            <w:proofErr w:type="spellEnd"/>
+                <w:lang w:val="en-US"/>
+              </w:rPr>
+              <w:t>start</w:t>
+            </w:r>
+            <w:proofErr w:type="gramEnd"/>
             <w:r>
               <w:rPr>
                 <w:rFonts w:ascii="Times New Roman" w:hAnsi="Times New Roman" w:cs="Times New Roman"/>
                 <w:sz w:val="24"/>
                 <w:szCs w:val="24"/>
-              </w:rPr>
-              <w:t>_</w:t>
-            </w:r>
+                <w:lang w:val="en-US"/>
+              </w:rPr>
+              <w:t>_date</w:t>
+            </w:r>
+            <w:proofErr w:type="spellEnd"/>
             <w:r>
               <w:rPr>
                 <w:rFonts w:ascii="Times New Roman" w:hAnsi="Times New Roman" w:cs="Times New Roman"/>
                 <w:sz w:val="24"/>
                 <w:szCs w:val="24"/>
-                <w:lang w:val="en-US"/>
-              </w:rPr>
-              <w:t>date</w:t>
+              </w:rPr>
+              <w:t xml:space="preserve"> </w:t>
             </w:r>
             <w:r>
               <w:rPr>
@@ -108,6 +111,7 @@
               </w:rPr>
               <w:t xml:space="preserve">г. </w:t>
             </w:r>
+            <w:proofErr w:type="gramStart"/>
             <w:r>
               <w:rPr>
                 <w:rFonts w:ascii="Times New Roman" w:hAnsi="Times New Roman" w:cs="Times New Roman"/>
@@ -125,7 +129,17 @@
                 <w:szCs w:val="24"/>
                 <w:lang w:val="en-US"/>
               </w:rPr>
-              <w:t>company_city</w:t>
+              <w:t>company</w:t>
+            </w:r>
+            <w:proofErr w:type="gramEnd"/>
+            <w:r>
+              <w:rPr>
+                <w:rFonts w:ascii="Times New Roman" w:hAnsi="Times New Roman" w:cs="Times New Roman"/>
+                <w:sz w:val="24"/>
+                <w:szCs w:val="24"/>
+                <w:lang w:val="en-US"/>
+              </w:rPr>
+              <w:t>_city</w:t>
             </w:r>
             <w:proofErr w:type="spellEnd"/>
             <w:r>
@@ -169,6 +183,7 @@
         </w:rPr>
         <w:t>Акт ввода ИСПДн «</w:t>
       </w:r>
+      <w:proofErr w:type="gramStart"/>
       <w:r>
         <w:rPr>
           <w:rFonts w:ascii="Times New Roman" w:hAnsi="Times New Roman" w:cs="Times New Roman"/>
@@ -192,6 +207,7 @@
         <w:t>ISPDn</w:t>
       </w:r>
       <w:proofErr w:type="spellEnd"/>
+      <w:proofErr w:type="gramEnd"/>
       <w:r>
         <w:rPr>
           <w:rFonts w:ascii="Times New Roman" w:hAnsi="Times New Roman" w:cs="Times New Roman"/>
@@ -202,6 +218,7 @@
         </w:rPr>
         <w:t>_</w:t>
       </w:r>
+      <w:proofErr w:type="gramStart"/>
       <w:r>
         <w:rPr>
           <w:rFonts w:ascii="Times New Roman" w:hAnsi="Times New Roman" w:cs="Times New Roman"/>
@@ -221,8 +238,9 @@
           <w:sz w:val="28"/>
           <w:szCs w:val="28"/>
         </w:rPr>
-        <w:t xml:space="preserve"> }}</w:t>
-      </w:r>
+        <w:t xml:space="preserve"> }</w:t>
+      </w:r>
+      <w:proofErr w:type="gramEnd"/>
       <w:r>
         <w:rPr>
           <w:rFonts w:ascii="Times New Roman" w:hAnsi="Times New Roman" w:cs="Times New Roman"/>
@@ -231,6 +249,16 @@
           <w:sz w:val="28"/>
           <w:szCs w:val="28"/>
         </w:rPr>
+        <w:t>}</w:t>
+      </w:r>
+      <w:r>
+        <w:rPr>
+          <w:rFonts w:ascii="Times New Roman" w:hAnsi="Times New Roman" w:cs="Times New Roman"/>
+          <w:b/>
+          <w:bCs/>
+          <w:sz w:val="28"/>
+          <w:szCs w:val="28"/>
+        </w:rPr>
         <w:t>»</w:t>
       </w:r>
     </w:p>
@@ -265,6 +293,7 @@
         </w:rPr>
         <w:t>«</w:t>
       </w:r>
+      <w:proofErr w:type="gramStart"/>
       <w:r>
         <w:rPr>
           <w:rFonts w:ascii="Times New Roman" w:hAnsi="Times New Roman" w:cs="Times New Roman"/>
@@ -284,6 +313,7 @@
         <w:t>ISPDn</w:t>
       </w:r>
       <w:proofErr w:type="spellEnd"/>
+      <w:proofErr w:type="gramEnd"/>
       <w:r>
         <w:rPr>
           <w:rFonts w:ascii="Times New Roman" w:hAnsi="Times New Roman" w:cs="Times New Roman"/>
@@ -292,6 +322,7 @@
         </w:rPr>
         <w:t>_</w:t>
       </w:r>
+      <w:proofErr w:type="gramStart"/>
       <w:r>
         <w:rPr>
           <w:rFonts w:ascii="Times New Roman" w:hAnsi="Times New Roman" w:cs="Times New Roman"/>
@@ -317,7 +348,16 @@
           <w:sz w:val="28"/>
           <w:szCs w:val="28"/>
         </w:rPr>
-        <w:t>}}</w:t>
+        <w:t>}</w:t>
+      </w:r>
+      <w:proofErr w:type="gramEnd"/>
+      <w:r>
+        <w:rPr>
+          <w:rFonts w:ascii="Times New Roman" w:hAnsi="Times New Roman" w:cs="Times New Roman"/>
+          <w:sz w:val="28"/>
+          <w:szCs w:val="28"/>
+        </w:rPr>
+        <w:t>}</w:t>
       </w:r>
       <w:r>
         <w:rPr>
@@ -398,6 +438,7 @@
               <w:t xml:space="preserve"> </w:t>
             </w:r>
             <w:proofErr w:type="spellStart"/>
+            <w:proofErr w:type="gramStart"/>
             <w:r>
               <w:rPr>
                 <w:rFonts w:ascii="Times New Roman" w:hAnsi="Times New Roman" w:cs="Times New Roman"/>
@@ -407,6 +448,7 @@
               <w:t>п.п</w:t>
             </w:r>
             <w:proofErr w:type="spellEnd"/>
+            <w:proofErr w:type="gramEnd"/>
           </w:p>
         </w:tc>
         <w:tc>
@@ -592,6 +634,7 @@
                 <w:lang w:val="en-US"/>
               </w:rPr>
             </w:pPr>
+            <w:proofErr w:type="gramStart"/>
             <w:r>
               <w:rPr>
                 <w:rFonts w:ascii="Times New Roman" w:hAnsi="Times New Roman"/>
@@ -609,7 +652,17 @@
                 <w:szCs w:val="28"/>
                 <w:lang w:val="en-US"/>
               </w:rPr>
-              <w:t>event.event_number</w:t>
+              <w:t>event</w:t>
+            </w:r>
+            <w:proofErr w:type="gramEnd"/>
+            <w:r>
+              <w:rPr>
+                <w:rFonts w:ascii="Times New Roman" w:hAnsi="Times New Roman"/>
+                <w:sz w:val="28"/>
+                <w:szCs w:val="28"/>
+                <w:lang w:val="en-US"/>
+              </w:rPr>
+              <w:t>.event_number</w:t>
             </w:r>
             <w:proofErr w:type="spellEnd"/>
             <w:r>
@@ -645,6 +698,7 @@
                 <w:lang w:val="en-US"/>
               </w:rPr>
             </w:pPr>
+            <w:proofErr w:type="gramStart"/>
             <w:r>
               <w:rPr>
                 <w:rFonts w:ascii="Times New Roman" w:hAnsi="Times New Roman" w:cs="Times New Roman"/>
@@ -662,7 +716,17 @@
                 <w:szCs w:val="28"/>
                 <w:lang w:val="en-US"/>
               </w:rPr>
-              <w:t>event.event_name</w:t>
+              <w:t>event</w:t>
+            </w:r>
+            <w:proofErr w:type="gramEnd"/>
+            <w:r>
+              <w:rPr>
+                <w:rFonts w:ascii="Times New Roman" w:hAnsi="Times New Roman" w:cs="Times New Roman"/>
+                <w:sz w:val="28"/>
+                <w:szCs w:val="28"/>
+                <w:lang w:val="en-US"/>
+              </w:rPr>
+              <w:t>.event_name</w:t>
             </w:r>
             <w:proofErr w:type="spellEnd"/>
             <w:r>
@@ -698,6 +762,7 @@
                 <w:lang w:val="en-US"/>
               </w:rPr>
             </w:pPr>
+            <w:proofErr w:type="gramStart"/>
             <w:r>
               <w:rPr>
                 <w:rFonts w:ascii="Times New Roman" w:hAnsi="Times New Roman" w:cs="Times New Roman"/>
@@ -715,7 +780,17 @@
                 <w:szCs w:val="28"/>
                 <w:lang w:val="en-US"/>
               </w:rPr>
-              <w:t>event.responsible_for_the_event</w:t>
+              <w:t>event</w:t>
+            </w:r>
+            <w:proofErr w:type="gramEnd"/>
+            <w:r>
+              <w:rPr>
+                <w:rFonts w:ascii="Times New Roman" w:hAnsi="Times New Roman" w:cs="Times New Roman"/>
+                <w:sz w:val="28"/>
+                <w:szCs w:val="28"/>
+                <w:lang w:val="en-US"/>
+              </w:rPr>
+              <w:t>.responsible_for_the_event</w:t>
             </w:r>
             <w:proofErr w:type="spellEnd"/>
             <w:r>
@@ -870,6 +945,7 @@
         </w:rPr>
         <w:t xml:space="preserve">Обнаружены следующие нарушения и недостатки: </w:t>
       </w:r>
+      <w:proofErr w:type="gramStart"/>
       <w:r>
         <w:rPr>
           <w:rFonts w:ascii="Times New Roman" w:hAnsi="Times New Roman" w:cs="Times New Roman"/>
@@ -885,7 +961,25 @@
           <w:sz w:val="28"/>
           <w:szCs w:val="28"/>
         </w:rPr>
-        <w:t>description_of_violations_and_disadvantages</w:t>
+        <w:t>description</w:t>
+      </w:r>
+      <w:proofErr w:type="gramEnd"/>
+      <w:r>
+        <w:rPr>
+          <w:rFonts w:ascii="Times New Roman" w:hAnsi="Times New Roman" w:cs="Times New Roman"/>
+          <w:sz w:val="28"/>
+          <w:szCs w:val="28"/>
+        </w:rPr>
+        <w:t>_of_violations_and_</w:t>
+      </w:r>
+      <w:proofErr w:type="gramStart"/>
+      <w:r>
+        <w:rPr>
+          <w:rFonts w:ascii="Times New Roman" w:hAnsi="Times New Roman" w:cs="Times New Roman"/>
+          <w:sz w:val="28"/>
+          <w:szCs w:val="28"/>
+        </w:rPr>
+        <w:t>disadvantages</w:t>
       </w:r>
       <w:proofErr w:type="spellEnd"/>
       <w:r>
@@ -894,7 +988,16 @@
           <w:sz w:val="28"/>
           <w:szCs w:val="28"/>
         </w:rPr>
-        <w:t xml:space="preserve"> }}</w:t>
+        <w:t xml:space="preserve"> }</w:t>
+      </w:r>
+      <w:proofErr w:type="gramEnd"/>
+      <w:r>
+        <w:rPr>
+          <w:rFonts w:ascii="Times New Roman" w:hAnsi="Times New Roman" w:cs="Times New Roman"/>
+          <w:sz w:val="28"/>
+          <w:szCs w:val="28"/>
+        </w:rPr>
+        <w:t>}</w:t>
       </w:r>
     </w:p>
     <w:p>
@@ -909,6 +1012,7 @@
         </w:rPr>
         <w:t xml:space="preserve">Рекомендуется: </w:t>
       </w:r>
+      <w:proofErr w:type="gramStart"/>
       <w:r>
         <w:rPr>
           <w:rFonts w:ascii="Times New Roman" w:hAnsi="Times New Roman" w:cs="Times New Roman"/>
@@ -926,6 +1030,7 @@
         </w:rPr>
         <w:t>recommendation</w:t>
       </w:r>
+      <w:proofErr w:type="gramEnd"/>
       <w:r>
         <w:rPr>
           <w:rFonts w:ascii="Times New Roman" w:hAnsi="Times New Roman" w:cs="Times New Roman"/>
@@ -985,6 +1090,7 @@
                 <w:lang w:val="en-US"/>
               </w:rPr>
             </w:pPr>
+            <w:proofErr w:type="gramStart"/>
             <w:r>
               <w:rPr>
                 <w:rFonts w:ascii="Times New Roman" w:hAnsi="Times New Roman" w:cs="Times New Roman"/>
@@ -1004,6 +1110,7 @@
               </w:rPr>
               <w:t>position</w:t>
             </w:r>
+            <w:proofErr w:type="gramEnd"/>
             <w:r>
               <w:rPr>
                 <w:rFonts w:ascii="Times New Roman" w:hAnsi="Times New Roman" w:cs="Times New Roman"/>

</xml_diff>